<commit_message>
Chapter 1 RRL: 5-7 year window (2019-2026) + References section
</commit_message>
<xml_diff>
--- a/THESIS DOCUMENTATION/Chapter1_Introduction_first.docx
+++ b/THESIS DOCUMENTATION/Chapter1_Introduction_first.docx
@@ -56,12 +56,12 @@
     </w:p>
     <w:p>
       <w:r>
-        <w:t>Globally, sustained ocean observation underpins maritime safety, weather analysis, and climate assessment, yet dense near-shore coverage remains uneven because professional instruments are costly to buy and maintain. Commercial wave buoys such as the Datawell Directional Waverider and NexSens modular platforms provide accurate wave and environmental measurements and serve as professional benchmarks, but they are intended for government agencies and large research institutions (see Section 1.3). This cost barrier has motivated a worldwide stream of low-cost buoy research. Albaladejo et al. (2012) demonstrated that a compact wireless-sensor buoy can support shallow-marine monitoring when affordability, stability, acquisition, communication, and autonomous power are designed as one system. Zhang et al. (2020) presented an integrated solar-powered buoy linked to a shore-based system, showing the importance of deliberate sensor integration and power design. More recently, Williams et al. (2025) reported a compact autonomous platform for current and seawater-parameter observation, reinforcing that modular, reproducible student-scale buoys are feasible.</w:t>
+        <w:t>Globally, sustained ocean observation underpins maritime safety, weather analysis, and climate assessment, yet dense near-shore coverage remains uneven because professional instruments are costly to buy and maintain. Commercial wave buoys such as the Datawell Directional Waverider and NexSens modular platforms provide accurate wave and environmental measurements and serve as professional benchmarks, but they are intended for government agencies and large research institutions (see Section 1.3). This cost barrier has motivated a worldwide stream of low-cost buoy research within the last seven years. Zhang et al. (2020) presented an integrated solar-powered buoy linked to a shore-based system, showing the importance of deliberate sensor integration and power design. More recently, Williams et al. (2025) reported a compact autonomous platform for current and seawater-parameter observation, reinforcing that modular, reproducible student-scale buoys are feasible.</w:t>
       </w:r>
     </w:p>
     <w:p>
       <w:r>
-        <w:t>On measurement science, the international literature is consistent on two points that shape this study. First, buoys do not observe the sea surface directly; they infer it through platform motion and sensor response, so hull response, mooring, transfer functions, and noise affect every result (Ardhuin et al., 2019; Thomson et al., 2018). Second, subsurface pressure can be converted to surface elevation only with documented treatment of sensor depth, frequency-dependent attenuation, and nonlinearity (Bishop &amp; Donelan, 1987; Bonneton et al., 2018; Martins et al., 2022). The international context therefore supports the project’s direction while imposing its central discipline: an affordable buoy may estimate wave statistics, but only calibration against an independent reference turns readings into defensible measurements.</w:t>
+        <w:t>On measurement science, the recent international literature shapes this study in two ways. First, buoys do not observe the sea surface directly; they infer it through platform motion and sensor response, so hull response, mooring, transfer functions, and noise affect every result (Ardhuin et al., 2019; Zhou et al., 2022). Second, subsurface pressure can be converted to surface elevation only with documented treatment of sensor depth, frequency-dependent attenuation, and nonlinearity; recent laboratory work by Martins et al. (2022) confirms that reconstruction quality depends on water depth, frequency, and the transfer formulation. Foundational pressure theory older than the 5- to 7-year window is acknowledged as background but is not counted among the recent sources. The recent literature therefore supports the direction of this study while imposing its central discipline: an affordable buoy may estimate wave statistics, but only calibration against an independent reference turns readings into defensible measurements.</w:t>
       </w:r>
     </w:p>
     <w:p>
@@ -115,17 +115,17 @@
     </w:p>
     <w:p>
       <w:r>
-        <w:t>Low-cost and autonomous marine platforms. The reviewed platforms show that physical design cannot be separated from information-system design: hull geometry, ballast, freeboard, mooring, antenna placement, cable entry, enclosure temperature, and solar exposure all influence the quality of the data that eventually reach the dashboard (Albaladejo et al., 2012; Zhang et al., 2020; Williams et al., 2025). FALCON therefore treats the buoy, power, communication, and software as one evaluation unit, following the integrated-evaluation principle also seen in marine battery-IoT work (Cho et al., 2021). Because low cost and sensor integration alone are well established, this study claims no novelty in building a buoy; its intended contribution is the documented integration and local evaluation of sensing, telemetry, shore processing, solar power, security telemetry, and transparent prediction research.</w:t>
+        <w:t>Low-cost and autonomous marine platforms. Recent platforms show that physical design cannot be separated from information-system design: hull geometry, ballast, freeboard, mooring, antenna placement, cable entry, enclosure temperature, and solar exposure all influence the quality of the data that eventually reach the dashboard (Zhang et al., 2020; Williams et al., 2025). FALCON therefore treats the buoy, power, communication, and software as one evaluation unit, following the integrated-evaluation principle also seen in recent marine battery-IoT work (Cho et al., 2021). Because low cost and sensor integration alone are well established in the recent literature, this study claims no novelty in building a buoy; its intended contribution is the documented integration and local evaluation of sensing, telemetry, shore processing, solar power, security telemetry, and transparent prediction research.</w:t>
       </w:r>
     </w:p>
     <w:p>
       <w:r>
-        <w:t>Motion-based and pressure-assisted wave measurement. Strapdown inertial sensing can yield wave information through orientation estimation, coordinate transformation, integration, and spectral analysis (Zhou et al., 2022), but raw vertical acceleration must never be labeled as wave height: gravity removal, bias, filtering, integration drift, sampling rate, synchronization, buoy response, and mooring all intervene (Ardhuin et al., 2019; Thomson et al., 2018). Pressure sensing offers an independent path, yet pressure is likewise not surface elevation until compensated; reconstruction quality depends on depth, frequency, nonlinearity, and the transfer formulation (Bishop &amp; Donelan, 1987; Bonneton et al., 2018; Martins et al., 2022). The study therefore defines its Phase 1 wave output as estimated significant wave height (Hs) over a stated window — a term that can be defined, aggregated, compared, and predicted consistently — and requires tank and near-shore comparison against an independent reference (staff gauge, synchronized video, reference logger, acoustic gauge, or validated instrument) before any accuracy claim.</w:t>
+        <w:t>Motion-based and pressure-assisted wave measurement. Strapdown inertial sensing can yield wave information through orientation estimation, coordinate transformation, integration, and spectral analysis (Zhou et al., 2022), but raw vertical acceleration must never be labeled as wave height: gravity removal, bias, filtering, integration drift, sampling rate, synchronization, buoy response, and mooring all intervene (Ardhuin et al., 2019). Pressure sensing offers an independent path, yet pressure is likewise not surface elevation until compensated; recent work shows reconstruction quality depends on depth, frequency, and the transfer formulation (Martins et al., 2022). The study therefore defines its Phase 1 wave output as estimated significant wave height (Hs) over a stated window, a term that can be defined, aggregated, compared, and predicted consistently, and requires tank and near-shore comparison against an independent reference (staff gauge, synchronized video, reference logger, acoustic gauge, or validated instrument) before any accuracy claim.</w:t>
       </w:r>
     </w:p>
     <w:p>
       <w:r>
-        <w:t>Solar energy, edge computing, and data quality. Marine autonomy is an energy balance among sensing, computation, communication, harvesting, and storage, best handled with degradation awareness and power-saving strategies (Cho et al., 2021; Grare et al., 2021; Wiranata &amp; Widodo, 2026). The literature supports FALCON’s division of work — deterministic acquisition, timestamping, buffering, and health checks on the ESP32; storage, processing, dashboard, and inference on shore power — provided it is validated by a measured load table and daily energy budget rather than component ratings. Because calibration drift, corrosion, limited energy, unreliable links, and missing references persistently degrade ocean-sensor data (Skålvik et al., 2023), every record in this study carries time validity, sensor-health information, and quality flags, and prediction is withheld or marked unreliable when required inputs fail checks.</w:t>
+        <w:t>Solar energy, edge computing, and data quality. Marine autonomy is an energy balance among sensing, computation, communication, harvesting, and storage, best handled with degradation awareness and power-saving strategies (Cho et al., 2021; Grare et al., 2021). The recent literature supports the division of work in this study: deterministic acquisition, timestamping, buffering, and health checks on the ESP32, with storage, processing, dashboard, and inference on shore power, provided it is validated by a measured load table and daily energy budget rather than component ratings. Because calibration drift, corrosion, limited energy, unreliable links, and missing references persistently degrade ocean-sensor data (Skalvik et al., 2023), every record in this study carries time validity, sensor-health information, and quality flags, and prediction is withheld or marked unreliable when required inputs fail checks.</w:t>
       </w:r>
     </w:p>
     <w:p>
@@ -140,7 +140,7 @@
     </w:p>
     <w:p>
       <w:r>
-        <w:t>Dashboards and usability. Because the intended readers include non-technical operators, dashboard design follows plain-label, large-text, explicit-state practice for older and non-technical users (Mohammadi et al., 2024): four fixed pages, GPS grouped under Supporting Telemetry, Settings as a compact header control, and every value labeled by source and freshness. Values shown in simulator mode are software demonstrations, never field measurements.</w:t>
+        <w:t>Dashboards and usability. Because the intended readers include older and non-technical operators such as fisherfolk leaders and barangay staff, the dashboard follows a plain-label, large-text, explicit-state design: four fixed pages (Overview, Buoy Motion, Sensors, Logs and Alerts), supporting telemetry grouped separately, and every value labeled by source and freshness. Values shown in simulator mode are software demonstrations, never field measurements. Usability is tested directly with representative operators in Chapter 2 rather than assumed from the display design.</w:t>
       </w:r>
     </w:p>
     <w:p>
@@ -807,6 +807,115 @@
         <w:t xml:space="preserve"> The non-AI reference forecast that future conditions equal current conditions; any AI candidate must beat it on untouched chronological test data to claim value.</w:t>
       </w:r>
     </w:p>
+    <w:p>
+      <w:pPr>
+        <w:pStyle w:val="Heading1"/>
+      </w:pPr>
+      <w:r>
+        <w:t>References</w:t>
+      </w:r>
+    </w:p>
+    <w:p>
+      <w:r>
+        <w:t>All peer-reviewed sources below fall within the 5- to 7-year window (2019-2026). Foundational works older than this window are treated as background and are not listed. Official institutional sources follow the research sources.</w:t>
+      </w:r>
+    </w:p>
+    <w:p>
+      <w:pPr/>
+      <w:r>
+        <w:t>Ardhuin, F., Stopa, J. E., Chapron, B., Collard, F., Husson, R., Jensen, R. E., Johannessen, J., Mouche, A., Passaro, M., Quartly, G. D., Swail, V., &amp; Young, I. (2019). Observing sea states. Frontiers in Marine Science, 6, Article 124. https://doi.org/10.3389/fmars.2019.00124</w:t>
+      </w:r>
+    </w:p>
+    <w:p>
+      <w:pPr/>
+      <w:r>
+        <w:t>Cho, J., Kim, M. W., Kim, Y., Park, J.-S., Lee, D.-H., Kim, Y., &amp; Kim, J. J. (2021). Seawater battery-based wireless marine buoy system with battery degradation prediction and multiple power optimization capabilities. IEEE Access, 9, 104104-104114. https://doi.org/10.1109/ACCESS.2021.3098846</w:t>
+      </w:r>
+    </w:p>
+    <w:p>
+      <w:pPr/>
+      <w:r>
+        <w:t>Dreyer, L. W., Pferscher, A., Sieve, R., Rabault, J., Jensen, A., Johnsen, E. B., &amp; Hope, G. (2026). OLB: An open LoRa buoy for coastal water measurements [Preprint]. arXiv. https://doi.org/10.48550/arXiv.2601.05615</w:t>
+      </w:r>
+    </w:p>
+    <w:p>
+      <w:pPr/>
+      <w:r>
+        <w:t>Fan, S., Xiao, N., &amp; Dong, S. (2020). A novel model to predict significant wave height based on long short-term memory network. Ocean Engineering, 205, Article 107298. https://doi.org/10.1016/j.oceaneng.2020.107298</w:t>
+      </w:r>
+    </w:p>
+    <w:p>
+      <w:pPr/>
+      <w:r>
+        <w:t>Grare, L., Statom, N. M., Pizzo, N., &amp; Lenain, L. (2021). Instrumented Wave Gliders for air-sea interaction and upper ocean research. Frontiers in Marine Science, 8, Article 664728. https://doi.org/10.3389/fmars.2021.664728</w:t>
+      </w:r>
+    </w:p>
+    <w:p>
+      <w:pPr/>
+      <w:r>
+        <w:t>Liu, Y., Ning, C., Zhang, Q., Yuan, G., &amp; Li, C. (2024). Research on ocean buoy attitude prediction model based on multi-dimensional feature fusion. Frontiers in Marine Science, 11, Article 1517170. https://doi.org/10.3389/fmars.2024.1517170</w:t>
+      </w:r>
+    </w:p>
+    <w:p>
+      <w:pPr/>
+      <w:r>
+        <w:t>Martins, K., Blenkinsopp, C. E., &amp; Zang, J. (2022). Measuring free surface elevation of shoaling waves with pressure transducers. Continental Shelf Research, 245, Article 104803. https://doi.org/10.1016/j.csr.2022.104803</w:t>
+      </w:r>
+    </w:p>
+    <w:p>
+      <w:pPr/>
+      <w:r>
+        <w:t>Mo, J., Wang, X., Huang, S., &amp; Wang, R. (2024). Advance in significant wave height prediction: A comprehensive survey. Complex System Modeling and Simulation, 4(4), 402-439. https://doi.org/10.23919/CSMS.2024.0019</w:t>
+      </w:r>
+    </w:p>
+    <w:p>
+      <w:pPr/>
+      <w:r>
+        <w:t>National Mapping and Resource Information Authority. (2025). NAMRIA annual report 2025. https://www.namria.gov.ph/</w:t>
+      </w:r>
+    </w:p>
+    <w:p>
+      <w:pPr/>
+      <w:r>
+        <w:t>Philippine Atmospheric, Geophysical and Astronomical Services Administration. (n.d.). Marine Meteorological Service Section: Functions and services. https://www.pagasa.dost.gov.ph/</w:t>
+      </w:r>
+    </w:p>
+    <w:p>
+      <w:pPr/>
+      <w:r>
+        <w:t>Raja Ali, H. A. K., Alajuri, M. H. S., &amp; Harahap, B. I. H. (2026). Implementation of IoT-based buoy position monitoring using GSM technology with SIM7000E module. Transactions on Maritime Science, 15(1). https://doi.org/10.7225/toms.v15.n01.002</w:t>
+      </w:r>
+    </w:p>
+    <w:p>
+      <w:pPr/>
+      <w:r>
+        <w:t>Skalvik, A. M., Saetre, C., Froysa, K.-E., Bjork, R. N., &amp; Tengberg, A. (2023). Challenges, limitations, and measurement strategies to ensure data quality in deep-sea sensors. Frontiers in Marine Science, 10, Article 1152236. https://doi.org/10.3389/fmars.2023.1152236</w:t>
+      </w:r>
+    </w:p>
+    <w:p>
+      <w:pPr/>
+      <w:r>
+        <w:t>Song, T., Wang, J., Huo, J., Wei, W., Han, R., Xu, D., &amp; Meng, F. (2023). Prediction of significant wave height based on EEMD and deep learning. Frontiers in Marine Science, 10, Article 1089357. https://doi.org/10.3389/fmars.2023.1089357</w:t>
+      </w:r>
+    </w:p>
+    <w:p>
+      <w:pPr/>
+      <w:r>
+        <w:t>Williams, Z., Soto Calvo, M. A., Lee, H. S., Aljber, M., &amp; Jeong, J.-S. (2025). A low-cost autonomous multi-functional buoy for ocean currents and seawater parameter monitoring, and particle tracking. Journal of Marine Science and Engineering, 13(9), Article 1629. https://doi.org/10.3390/jmse13091629</w:t>
+      </w:r>
+    </w:p>
+    <w:p>
+      <w:pPr/>
+      <w:r>
+        <w:t>Zhang, H., Zhang, D., &amp; Zhang, A. (2020). An innovative multifunctional buoy design for monitoring continuous environmental dynamics at Tianjin Port. IEEE Access, 8, 171820-171833. https://doi.org/10.1109/ACCESS.2020.3024020</w:t>
+      </w:r>
+    </w:p>
+    <w:p>
+      <w:pPr/>
+      <w:r>
+        <w:t>Zhou, F., Zhang, R., &amp; Zhang, S. (2022). Measurement principle and technology of miniaturized strapdown inertial wave sensor. Frontiers in Marine Science, 9, Article 991996. https://doi.org/10.3389/fmars.2022.991996</w:t>
+      </w:r>
+    </w:p>
     <w:sectPr>
       <w:pgSz w:w="12240" w:h="15840"/>
       <w:pgMar w:top="1440" w:right="1800" w:bottom="1440" w:left="1800" w:header="720" w:footer="720" w:gutter="0"/>

</xml_diff>